<commit_message>
Integrate multipanel figures into ISCLS manuscript
</commit_message>
<xml_diff>
--- a/ISCLS_revision/blinded_main_manuscript.docx
+++ b/ISCLS_revision/blinded_main_manuscript.docx
@@ -1174,12 +1174,13 @@
     </w:p>
     <w:p>
       <w:pPr>
+        <w:spacing w:line="288" w:lineRule="auto"/>
         <w:jc w:val="center"/>
       </w:pPr>
       <w:r>
         <w:drawing>
           <wp:inline xmlns:a="http://schemas.openxmlformats.org/drawingml/2006/main" xmlns:pic="http://schemas.openxmlformats.org/drawingml/2006/picture">
-            <wp:extent cx="5669280" cy="2521082"/>
+            <wp:extent cx="6217920" cy="4571581"/>
             <wp:docPr id="1" name="Picture 1"/>
             <wp:cNvGraphicFramePr>
               <a:graphicFrameLocks noChangeAspect="1"/>
@@ -1188,11 +1189,11 @@
               <a:graphicData uri="http://schemas.openxmlformats.org/drawingml/2006/picture">
                 <pic:pic>
                   <pic:nvPicPr>
-                    <pic:cNvPr id="0" name="figure0_benchmark_design_schematic.png"/>
+                    <pic:cNvPr id="0" name="figure1_study_design_600dpi.png"/>
                     <pic:cNvPicPr/>
                   </pic:nvPicPr>
                   <pic:blipFill>
-                    <a:blip r:embed="rId9"/>
+                    <a:blip r:embed="rId16"/>
                     <a:stretch>
                       <a:fillRect/>
                     </a:stretch>
@@ -1200,7 +1201,7 @@
                   <pic:spPr>
                     <a:xfrm>
                       <a:off x="0" y="0"/>
-                      <a:ext cx="5669280" cy="2521082"/>
+                      <a:ext cx="6217920" cy="4571581"/>
                     </a:xfrm>
                     <a:prstGeom prst="rect"/>
                   </pic:spPr>
@@ -1213,13 +1214,68 @@
     </w:p>
     <w:p>
       <w:pPr>
-        <w:spacing w:line="288" w:lineRule="auto"/>
+        <w:spacing w:line="276" w:lineRule="auto"/>
       </w:pPr>
       <w:r>
         <w:rPr>
+          <w:rFonts w:ascii="Times New Roman" w:hAnsi="Times New Roman"/>
           <w:i/>
+          <w:sz w:val="18"/>
         </w:rPr>
-        <w:t>Figure 1. Leakage-aware benchmark workflow. The workflow starts from public CELLxGENE metadata and hosted embeddings, restricts analysis to an eligible blood T-cell benchmark stratum, then evaluates fixed scVI and TranscriptFormer representations with metadata-only, donor-aware, disease-aware, dataset-aware, label-shuffling, LODO, and sampling-depth diagnostics. The figure emphasizes the validation designs used to detect identity leakage, metadata confounding, study-origin shift, and label-unit mismatch.</w:t>
+        <w:t>Figure 1. Study design and leakage-aware evaluation framework. The figure summarizes benchmark construction from public CELLxGENE metadata, fixed hosted scVI and TranscriptFormer representations, the metadata-only baseline, potential leakage and confounding pathways, validation strategies, diagnostic controls, and core AUROC findings. Dashed arrows indicate potential leakage or confounding pathways targeted by diagnostics, not proven causal mechanisms. Intervals describe split-seed variability.</w:t>
+      </w:r>
+    </w:p>
+    <w:p>
+      <w:pPr>
+        <w:spacing w:line="288" w:lineRule="auto"/>
+        <w:jc w:val="center"/>
+      </w:pPr>
+      <w:r>
+        <w:drawing>
+          <wp:inline xmlns:a="http://schemas.openxmlformats.org/drawingml/2006/main" xmlns:pic="http://schemas.openxmlformats.org/drawingml/2006/picture">
+            <wp:extent cx="6217920" cy="4750097"/>
+            <wp:docPr id="2" name="Picture 2"/>
+            <wp:cNvGraphicFramePr>
+              <a:graphicFrameLocks noChangeAspect="1"/>
+            </wp:cNvGraphicFramePr>
+            <a:graphic>
+              <a:graphicData uri="http://schemas.openxmlformats.org/drawingml/2006/picture">
+                <pic:pic>
+                  <pic:nvPicPr>
+                    <pic:cNvPr id="0" name="figure2_data_confounds_600dpi.png"/>
+                    <pic:cNvPicPr/>
+                  </pic:nvPicPr>
+                  <pic:blipFill>
+                    <a:blip r:embed="rId17"/>
+                    <a:stretch>
+                      <a:fillRect/>
+                    </a:stretch>
+                  </pic:blipFill>
+                  <pic:spPr>
+                    <a:xfrm>
+                      <a:off x="0" y="0"/>
+                      <a:ext cx="6217920" cy="4750097"/>
+                    </a:xfrm>
+                    <a:prstGeom prst="rect"/>
+                  </pic:spPr>
+                </pic:pic>
+              </a:graphicData>
+            </a:graphic>
+          </wp:inline>
+        </w:drawing>
+      </w:r>
+    </w:p>
+    <w:p>
+      <w:pPr>
+        <w:spacing w:line="276" w:lineRule="auto"/>
+      </w:pPr>
+      <w:r>
+        <w:rPr>
+          <w:rFonts w:ascii="Times New Roman" w:hAnsi="Times New Roman"/>
+          <w:i/>
+          <w:sz w:val="18"/>
+        </w:rPr>
+        <w:t>Figure 2. Cellular landscape, cohort structure and sources of confounding. Panels show a PCA projection of the cached TranscriptFormer embedding for 1,075 benchmark cells, donor-level age labels, study-origin structure, donor-level metadata patterns, donor-level metadata composition, 30-seed AUROC distributions, and seed-matched AUROC differences relative to metadata-only. The sampled metadata contain one reported cell-type label, T cell; no T-cell subtypes were inferred.</w:t>
       </w:r>
     </w:p>
     <w:p>
@@ -1240,56 +1296,6 @@
     </w:p>
     <w:p>
       <w:pPr>
-        <w:jc w:val="center"/>
-      </w:pPr>
-      <w:r>
-        <w:drawing>
-          <wp:inline xmlns:a="http://schemas.openxmlformats.org/drawingml/2006/main" xmlns:pic="http://schemas.openxmlformats.org/drawingml/2006/picture">
-            <wp:extent cx="5669280" cy="4037513"/>
-            <wp:docPr id="2" name="Picture 2"/>
-            <wp:cNvGraphicFramePr>
-              <a:graphicFrameLocks noChangeAspect="1"/>
-            </wp:cNvGraphicFramePr>
-            <a:graphic>
-              <a:graphicData uri="http://schemas.openxmlformats.org/drawingml/2006/picture">
-                <pic:pic>
-                  <pic:nvPicPr>
-                    <pic:cNvPr id="0" name="figure6_age_label_confounding_structure.png"/>
-                    <pic:cNvPicPr/>
-                  </pic:nvPicPr>
-                  <pic:blipFill>
-                    <a:blip r:embed="rId10"/>
-                    <a:stretch>
-                      <a:fillRect/>
-                    </a:stretch>
-                  </pic:blipFill>
-                  <pic:spPr>
-                    <a:xfrm>
-                      <a:off x="0" y="0"/>
-                      <a:ext cx="5669280" cy="4037513"/>
-                    </a:xfrm>
-                    <a:prstGeom prst="rect"/>
-                  </pic:spPr>
-                </pic:pic>
-              </a:graphicData>
-            </a:graphic>
-          </wp:inline>
-        </w:drawing>
-      </w:r>
-    </w:p>
-    <w:p>
-      <w:pPr>
-        <w:spacing w:line="288" w:lineRule="auto"/>
-      </w:pPr>
-      <w:r>
-        <w:rPr>
-          <w:i/>
-        </w:rPr>
-        <w:t>Figure 2. Benchmark cohort and metadata-confounding structure. The panels summarize how young and old labels were distributed across public metadata variables in the completed blood T-cell stratum, including dataset, assay, sex, and disease-related fields. These summaries motivate the metadata-only baseline and grouped validation designs used later in the benchmark.</w:t>
-      </w:r>
-    </w:p>
-    <w:p>
-      <w:pPr>
         <w:pStyle w:val="Heading2"/>
       </w:pPr>
       <w:r>
@@ -1302,56 +1308,6 @@
       </w:pPr>
       <w:r>
         <w:t>Random-cell evaluation gave relatively high apparent performance for both embeddings and the metadata-only baseline. The metadata-only model reached AUROC 0.769 (0.762-0.776), compared with 0.749 (0.744-0.754) for TranscriptFormer and 0.707 (0.699-0.716) for scVI. Because the metadata-only model exceeded or matched embedding models in this setting, random-cell performance was interpreted as potentially inflated by donor-, study-, assay-, or metadata-derived structure.</w:t>
-      </w:r>
-    </w:p>
-    <w:p>
-      <w:pPr>
-        <w:jc w:val="center"/>
-      </w:pPr>
-      <w:r>
-        <w:drawing>
-          <wp:inline xmlns:a="http://schemas.openxmlformats.org/drawingml/2006/main" xmlns:pic="http://schemas.openxmlformats.org/drawingml/2006/picture">
-            <wp:extent cx="5669280" cy="2519680"/>
-            <wp:docPr id="3" name="Picture 3"/>
-            <wp:cNvGraphicFramePr>
-              <a:graphicFrameLocks noChangeAspect="1"/>
-            </wp:cNvGraphicFramePr>
-            <a:graphic>
-              <a:graphicData uri="http://schemas.openxmlformats.org/drawingml/2006/picture">
-                <pic:pic>
-                  <pic:nvPicPr>
-                    <pic:cNvPr id="0" name="figure4_blood_tcell_30seed_performance.png"/>
-                    <pic:cNvPicPr/>
-                  </pic:nvPicPr>
-                  <pic:blipFill>
-                    <a:blip r:embed="rId11"/>
-                    <a:stretch>
-                      <a:fillRect/>
-                    </a:stretch>
-                  </pic:blipFill>
-                  <pic:spPr>
-                    <a:xfrm>
-                      <a:off x="0" y="0"/>
-                      <a:ext cx="5669280" cy="2519680"/>
-                    </a:xfrm>
-                    <a:prstGeom prst="rect"/>
-                  </pic:spPr>
-                </pic:pic>
-              </a:graphicData>
-            </a:graphic>
-          </wp:inline>
-        </w:drawing>
-      </w:r>
-    </w:p>
-    <w:p>
-      <w:pPr>
-        <w:spacing w:line="288" w:lineRule="auto"/>
-      </w:pPr>
-      <w:r>
-        <w:rPr>
-          <w:i/>
-        </w:rPr>
-        <w:t>Figure 3. Thirty-seed performance across validation designs. AUROC, AUPRC, and balanced accuracy are summarized across random-cell, donor-holdout, grouped dataset-holdout, disease-free, and donor-mean analyses. Random-cell results should be interpreted as apparent performance because cells from the same donor or study structure can create optimistic estimates.</w:t>
       </w:r>
     </w:p>
     <w:p>
@@ -2068,56 +2024,6 @@
     </w:p>
     <w:p>
       <w:pPr>
-        <w:jc w:val="center"/>
-      </w:pPr>
-      <w:r>
-        <w:drawing>
-          <wp:inline xmlns:a="http://schemas.openxmlformats.org/drawingml/2006/main" xmlns:pic="http://schemas.openxmlformats.org/drawingml/2006/picture">
-            <wp:extent cx="5669280" cy="4566920"/>
-            <wp:docPr id="4" name="Picture 4"/>
-            <wp:cNvGraphicFramePr>
-              <a:graphicFrameLocks noChangeAspect="1"/>
-            </wp:cNvGraphicFramePr>
-            <a:graphic>
-              <a:graphicData uri="http://schemas.openxmlformats.org/drawingml/2006/picture">
-                <pic:pic>
-                  <pic:nvPicPr>
-                    <pic:cNvPr id="0" name="figure6b_metadata_coefficients.png"/>
-                    <pic:cNvPicPr/>
-                  </pic:nvPicPr>
-                  <pic:blipFill>
-                    <a:blip r:embed="rId12"/>
-                    <a:stretch>
-                      <a:fillRect/>
-                    </a:stretch>
-                  </pic:blipFill>
-                  <pic:spPr>
-                    <a:xfrm>
-                      <a:off x="0" y="0"/>
-                      <a:ext cx="5669280" cy="4566920"/>
-                    </a:xfrm>
-                    <a:prstGeom prst="rect"/>
-                  </pic:spPr>
-                </pic:pic>
-              </a:graphicData>
-            </a:graphic>
-          </wp:inline>
-        </w:drawing>
-      </w:r>
-    </w:p>
-    <w:p>
-      <w:pPr>
-        <w:spacing w:line="288" w:lineRule="auto"/>
-      </w:pPr>
-      <w:r>
-        <w:rPr>
-          <w:i/>
-        </w:rPr>
-        <w:t>Figure 4. Metadata-only model coefficients. Coefficients summarize the non-expression metadata variables that contributed to metadata-only age classification. The model was included as a confounding diagnostic rather than as a biological predictor, because strong metadata-only performance indicates that age labels can be partly recoverable from public metadata and study structure.</w:t>
-      </w:r>
-    </w:p>
-    <w:p>
-      <w:pPr>
         <w:pStyle w:val="Heading2"/>
       </w:pPr>
       <w:r>
@@ -2130,56 +2036,6 @@
       </w:pPr>
       <w:r>
         <w:t>Disease-free donor-holdout analyses retained high performance for donor-mean embeddings, with AUROC 0.905 (0.896-0.915) for TranscriptFormer and 0.802 (0.781-0.823) for scVI. Cell-level disease-free donor-holdout AUROC was 0.790 (0.778-0.802) for TranscriptFormer and 0.681 (0.666-0.695) for scVI. Label-shuffling diagnostics remained part of the audit framework and were used to identify performance patterns compatible with split or metadata artifacts.</w:t>
-      </w:r>
-    </w:p>
-    <w:p>
-      <w:pPr>
-        <w:jc w:val="center"/>
-      </w:pPr>
-      <w:r>
-        <w:drawing>
-          <wp:inline xmlns:a="http://schemas.openxmlformats.org/drawingml/2006/main" xmlns:pic="http://schemas.openxmlformats.org/drawingml/2006/picture">
-            <wp:extent cx="5669280" cy="2768718"/>
-            <wp:docPr id="5" name="Picture 5"/>
-            <wp:cNvGraphicFramePr>
-              <a:graphicFrameLocks noChangeAspect="1"/>
-            </wp:cNvGraphicFramePr>
-            <a:graphic>
-              <a:graphicData uri="http://schemas.openxmlformats.org/drawingml/2006/picture">
-                <pic:pic>
-                  <pic:nvPicPr>
-                    <pic:cNvPr id="0" name="figure5_30seed_leakage_diagnostics.png"/>
-                    <pic:cNvPicPr/>
-                  </pic:nvPicPr>
-                  <pic:blipFill>
-                    <a:blip r:embed="rId13"/>
-                    <a:stretch>
-                      <a:fillRect/>
-                    </a:stretch>
-                  </pic:blipFill>
-                  <pic:spPr>
-                    <a:xfrm>
-                      <a:off x="0" y="0"/>
-                      <a:ext cx="5669280" cy="2768718"/>
-                    </a:xfrm>
-                    <a:prstGeom prst="rect"/>
-                  </pic:spPr>
-                </pic:pic>
-              </a:graphicData>
-            </a:graphic>
-          </wp:inline>
-        </w:drawing>
-      </w:r>
-    </w:p>
-    <w:p>
-      <w:pPr>
-        <w:spacing w:line="288" w:lineRule="auto"/>
-      </w:pPr>
-      <w:r>
-        <w:rPr>
-          <w:i/>
-        </w:rPr>
-        <w:t>Figure 5. Disease-free and label-shuffling diagnostics. Disease-free analyses evaluate whether results persist after excluding donors with recorded disease labels, whereas label-shuffling controls estimate performance compatible with split-specific or metadata artifacts. These diagnostics constrain, but do not eliminate, residual cohort and assay effects.</w:t>
       </w:r>
     </w:p>
     <w:p>
@@ -2200,56 +2056,6 @@
     </w:p>
     <w:p>
       <w:pPr>
-        <w:jc w:val="center"/>
-      </w:pPr>
-      <w:r>
-        <w:drawing>
-          <wp:inline xmlns:a="http://schemas.openxmlformats.org/drawingml/2006/main" xmlns:pic="http://schemas.openxmlformats.org/drawingml/2006/picture">
-            <wp:extent cx="5669280" cy="2685448"/>
-            <wp:docPr id="6" name="Picture 6"/>
-            <wp:cNvGraphicFramePr>
-              <a:graphicFrameLocks noChangeAspect="1"/>
-            </wp:cNvGraphicFramePr>
-            <a:graphic>
-              <a:graphicData uri="http://schemas.openxmlformats.org/drawingml/2006/picture">
-                <pic:pic>
-                  <pic:nvPicPr>
-                    <pic:cNvPr id="0" name="figure7_lodo_dataset_holdout.png"/>
-                    <pic:cNvPicPr/>
-                  </pic:nvPicPr>
-                  <pic:blipFill>
-                    <a:blip r:embed="rId14"/>
-                    <a:stretch>
-                      <a:fillRect/>
-                    </a:stretch>
-                  </pic:blipFill>
-                  <pic:spPr>
-                    <a:xfrm>
-                      <a:off x="0" y="0"/>
-                      <a:ext cx="5669280" cy="2685448"/>
-                    </a:xfrm>
-                    <a:prstGeom prst="rect"/>
-                  </pic:spPr>
-                </pic:pic>
-              </a:graphicData>
-            </a:graphic>
-          </wp:inline>
-        </w:drawing>
-      </w:r>
-    </w:p>
-    <w:p>
-      <w:pPr>
-        <w:spacing w:line="288" w:lineRule="auto"/>
-      </w:pPr>
-      <w:r>
-        <w:rPr>
-          <w:i/>
-        </w:rPr>
-        <w:t>Figure 6. Leave-one-dataset-out diagnostic. Only one dataset satisfied the requirement that both the held-out dataset and the remaining training data contain young and old donors. Performance on this eligible held-out dataset is therefore reported as a limited dataset-transfer diagnostic, not as multicohort external validation.</w:t>
-      </w:r>
-    </w:p>
-    <w:p>
-      <w:pPr>
         <w:pStyle w:val="Heading2"/>
       </w:pPr>
       <w:r>
@@ -2262,56 +2068,6 @@
       </w:pPr>
       <w:r>
         <w:t>Sampling-depth sensitivity showed that donor-mean performance depended on the number of cells contributing to a donor summary. TranscriptFormer donor-holdout AUROC increased from 0.671 at one requested cell per donor to 0.855 at eight cells per donor. The requested 16-cell condition was capped by the existing eight-cell-per-donor sample and therefore reproduced the eight-cell result rather than adding new cellular depth.</w:t>
-      </w:r>
-    </w:p>
-    <w:p>
-      <w:pPr>
-        <w:jc w:val="center"/>
-      </w:pPr>
-      <w:r>
-        <w:drawing>
-          <wp:inline xmlns:a="http://schemas.openxmlformats.org/drawingml/2006/main" xmlns:pic="http://schemas.openxmlformats.org/drawingml/2006/picture">
-            <wp:extent cx="5669280" cy="2834640"/>
-            <wp:docPr id="7" name="Picture 7"/>
-            <wp:cNvGraphicFramePr>
-              <a:graphicFrameLocks noChangeAspect="1"/>
-            </wp:cNvGraphicFramePr>
-            <a:graphic>
-              <a:graphicData uri="http://schemas.openxmlformats.org/drawingml/2006/picture">
-                <pic:pic>
-                  <pic:nvPicPr>
-                    <pic:cNvPr id="0" name="figure8_sampling_depth_sensitivity.png"/>
-                    <pic:cNvPicPr/>
-                  </pic:nvPicPr>
-                  <pic:blipFill>
-                    <a:blip r:embed="rId15"/>
-                    <a:stretch>
-                      <a:fillRect/>
-                    </a:stretch>
-                  </pic:blipFill>
-                  <pic:spPr>
-                    <a:xfrm>
-                      <a:off x="0" y="0"/>
-                      <a:ext cx="5669280" cy="2834640"/>
-                    </a:xfrm>
-                    <a:prstGeom prst="rect"/>
-                  </pic:spPr>
-                </pic:pic>
-              </a:graphicData>
-            </a:graphic>
-          </wp:inline>
-        </w:drawing>
-      </w:r>
-    </w:p>
-    <w:p>
-      <w:pPr>
-        <w:spacing w:line="288" w:lineRule="auto"/>
-      </w:pPr>
-      <w:r>
-        <w:rPr>
-          <w:i/>
-        </w:rPr>
-        <w:t>Figure 7. Sampling-depth sensitivity. Donor-mean embedding performance is shown as the requested number of cells per donor increases. The 16-cell condition is capped by the available eight-cell-per-donor sample, so it repeats the eight-cell result and should not be interpreted as additional sampling depth.</w:t>
       </w:r>
     </w:p>
     <w:p>

</xml_diff>